<commit_message>
Add the desktop screenshots to the APA report.
Co-authored-by: zengpu29 <zengpu29@gmail.com>
</commit_message>
<xml_diff>
--- a/DEVELOPMENT_REPORT.docx
+++ b/DEVELOPMENT_REPORT.docx
@@ -437,7 +437,246 @@
           <w:color w:val="000000"/>
           <w:sz w:val="24"/>
         </w:rPr>
-        <w:t>No separate time log was kept. These clocks are coordinated universal time on October 18, 2026. The build request arrived at 1:43 a.m. The package file was written at 2:00 a.m., the recommendation module at 2:02 a.m., the README at 2:11 a.m., and the servers first started at 2:12 a.m. The recommendations page was last edited at 2:54 a.m. and the notes at 2:57 a.m., 1 hour and 14 minutes after the request. Servers were stopped near 3:29 a.m., restarted near 3:31 a.m., and screenshots were taken near 3:37 a.m. and 3:38 a.m.</w:t>
+        <w:t>No separate time log was kept. These clocks are coordinated universal time on October 18, 2026. The build request arrived at 1:43 a.m. The package file was written at 2:00 a.m., the recommendation module at 2:02 a.m., the README at 2:11 a.m., and the servers first started at 2:12 a.m. The recommendations page was last edited at 2:54 a.m. and the notes at 2:57 a.m., 1 hour and 14 minutes after the request. Servers were stopped near 3:29 a.m. and restarted near 3:31 a.m.</w:t>
+      </w:r>
+    </w:p>
+    <w:p>
+      <w:pPr>
+        <w:spacing w:line="480" w:lineRule="auto" w:before="0" w:after="0"/>
+        <w:ind w:left="0" w:firstLine="720"/>
+        <w:jc w:val="left"/>
+      </w:pPr>
+      <w:r>
+        <w:rPr>
+          <w:rFonts w:ascii="Times New Roman" w:hAnsi="Times New Roman" w:cs="Times New Roman" w:eastAsia="Times New Roman"/>
+          <w:b w:val="0"/>
+          <w:i w:val="0"/>
+          <w:color w:val="000000"/>
+          <w:sz w:val="24"/>
+        </w:rPr>
+        <w:t>Figure 1 shows the completed code open on the desktop at 3:38 a.m. Figure 2 shows BiteWise AI running in the browser at localhost port 5173 at 3:37 a.m. Both clocks are the system clock.</w:t>
+      </w:r>
+      <w:r>
+        <w:rPr>
+          <w:rFonts w:ascii="Times New Roman" w:hAnsi="Times New Roman" w:cs="Times New Roman" w:eastAsia="Times New Roman"/>
+          <w:b w:val="0"/>
+          <w:i w:val="0"/>
+          <w:color w:val="000000"/>
+          <w:sz w:val="24"/>
+        </w:rPr>
+        <w:br w:type="page"/>
+      </w:r>
+    </w:p>
+    <w:p>
+      <w:pPr>
+        <w:spacing w:line="480" w:lineRule="auto" w:before="0" w:after="0"/>
+        <w:ind w:left="0" w:firstLine="0"/>
+        <w:jc w:val="left"/>
+      </w:pPr>
+      <w:r>
+        <w:rPr>
+          <w:rFonts w:ascii="Times New Roman" w:hAnsi="Times New Roman" w:cs="Times New Roman" w:eastAsia="Times New Roman"/>
+          <w:b/>
+          <w:i w:val="0"/>
+          <w:color w:val="000000"/>
+          <w:sz w:val="24"/>
+        </w:rPr>
+        <w:t>Figure 1</w:t>
+      </w:r>
+    </w:p>
+    <w:p>
+      <w:pPr>
+        <w:spacing w:line="480" w:lineRule="auto" w:before="0" w:after="0"/>
+        <w:ind w:left="0" w:firstLine="0"/>
+        <w:jc w:val="left"/>
+      </w:pPr>
+      <w:r>
+        <w:rPr>
+          <w:rFonts w:ascii="Times New Roman" w:hAnsi="Times New Roman" w:cs="Times New Roman" w:eastAsia="Times New Roman"/>
+          <w:b w:val="0"/>
+          <w:i/>
+          <w:color w:val="000000"/>
+          <w:sz w:val="24"/>
+        </w:rPr>
+        <w:t>Project Code Open on the Desktop</w:t>
+      </w:r>
+    </w:p>
+    <w:p>
+      <w:pPr>
+        <w:spacing w:before="120" w:after="120" w:line="240" w:lineRule="auto"/>
+        <w:jc w:val="center"/>
+      </w:pPr>
+      <w:r>
+        <w:drawing>
+          <wp:inline xmlns:a="http://schemas.openxmlformats.org/drawingml/2006/main" xmlns:pic="http://schemas.openxmlformats.org/drawingml/2006/picture">
+            <wp:extent cx="5943600" cy="3714750"/>
+            <wp:docPr id="1" name="Picture 1"/>
+            <wp:cNvGraphicFramePr>
+              <a:graphicFrameLocks noChangeAspect="1"/>
+            </wp:cNvGraphicFramePr>
+            <a:graphic>
+              <a:graphicData uri="http://schemas.openxmlformats.org/drawingml/2006/picture">
+                <pic:pic>
+                  <pic:nvPicPr>
+                    <pic:cNvPr id="0" name="ide-code.png"/>
+                    <pic:cNvPicPr/>
+                  </pic:nvPicPr>
+                  <pic:blipFill>
+                    <a:blip r:embed="rId10"/>
+                    <a:stretch>
+                      <a:fillRect/>
+                    </a:stretch>
+                  </pic:blipFill>
+                  <pic:spPr>
+                    <a:xfrm>
+                      <a:off x="0" y="0"/>
+                      <a:ext cx="5943600" cy="3714750"/>
+                    </a:xfrm>
+                    <a:prstGeom prst="rect"/>
+                  </pic:spPr>
+                </pic:pic>
+              </a:graphicData>
+            </a:graphic>
+          </wp:inline>
+        </w:drawing>
+      </w:r>
+    </w:p>
+    <w:p>
+      <w:pPr>
+        <w:spacing w:line="480" w:lineRule="auto" w:before="0" w:after="0"/>
+        <w:ind w:left="0" w:firstLine="0"/>
+        <w:jc w:val="left"/>
+      </w:pPr>
+      <w:r>
+        <w:rPr>
+          <w:rFonts w:ascii="Times New Roman" w:hAnsi="Times New Roman" w:cs="Times New Roman" w:eastAsia="Times New Roman"/>
+          <w:b w:val="0"/>
+          <w:i/>
+          <w:color w:val="000000"/>
+          <w:sz w:val="24"/>
+        </w:rPr>
+        <w:t xml:space="preserve">Note. </w:t>
+      </w:r>
+      <w:r>
+        <w:rPr>
+          <w:rFonts w:ascii="Times New Roman" w:hAnsi="Times New Roman" w:cs="Times New Roman" w:eastAsia="Times New Roman"/>
+          <w:b w:val="0"/>
+          <w:i w:val="0"/>
+          <w:color w:val="000000"/>
+          <w:sz w:val="24"/>
+        </w:rPr>
+        <w:t>The system clock reads 3:38 a.m. on October 18, 2026. The open file is server/src/gemini.js.</w:t>
+      </w:r>
+      <w:r>
+        <w:rPr>
+          <w:rFonts w:ascii="Times New Roman" w:hAnsi="Times New Roman" w:cs="Times New Roman" w:eastAsia="Times New Roman"/>
+          <w:b w:val="0"/>
+          <w:i w:val="0"/>
+          <w:color w:val="000000"/>
+          <w:sz w:val="24"/>
+        </w:rPr>
+        <w:br w:type="page"/>
+      </w:r>
+    </w:p>
+    <w:p>
+      <w:pPr>
+        <w:spacing w:line="480" w:lineRule="auto" w:before="0" w:after="0"/>
+        <w:ind w:left="0" w:firstLine="0"/>
+        <w:jc w:val="left"/>
+      </w:pPr>
+      <w:r>
+        <w:rPr>
+          <w:rFonts w:ascii="Times New Roman" w:hAnsi="Times New Roman" w:cs="Times New Roman" w:eastAsia="Times New Roman"/>
+          <w:b/>
+          <w:i w:val="0"/>
+          <w:color w:val="000000"/>
+          <w:sz w:val="24"/>
+        </w:rPr>
+        <w:t>Figure 2</w:t>
+      </w:r>
+    </w:p>
+    <w:p>
+      <w:pPr>
+        <w:spacing w:line="480" w:lineRule="auto" w:before="0" w:after="0"/>
+        <w:ind w:left="0" w:firstLine="0"/>
+        <w:jc w:val="left"/>
+      </w:pPr>
+      <w:r>
+        <w:rPr>
+          <w:rFonts w:ascii="Times New Roman" w:hAnsi="Times New Roman" w:cs="Times New Roman" w:eastAsia="Times New Roman"/>
+          <w:b w:val="0"/>
+          <w:i/>
+          <w:color w:val="000000"/>
+          <w:sz w:val="24"/>
+        </w:rPr>
+        <w:t>BiteWise AI Running on Localhost</w:t>
+      </w:r>
+    </w:p>
+    <w:p>
+      <w:pPr>
+        <w:spacing w:before="120" w:after="120" w:line="240" w:lineRule="auto"/>
+        <w:jc w:val="center"/>
+      </w:pPr>
+      <w:r>
+        <w:drawing>
+          <wp:inline xmlns:a="http://schemas.openxmlformats.org/drawingml/2006/main" xmlns:pic="http://schemas.openxmlformats.org/drawingml/2006/picture">
+            <wp:extent cx="5943600" cy="3714750"/>
+            <wp:docPr id="2" name="Picture 2"/>
+            <wp:cNvGraphicFramePr>
+              <a:graphicFrameLocks noChangeAspect="1"/>
+            </wp:cNvGraphicFramePr>
+            <a:graphic>
+              <a:graphicData uri="http://schemas.openxmlformats.org/drawingml/2006/picture">
+                <pic:pic>
+                  <pic:nvPicPr>
+                    <pic:cNvPr id="0" name="localhost-app.png"/>
+                    <pic:cNvPicPr/>
+                  </pic:nvPicPr>
+                  <pic:blipFill>
+                    <a:blip r:embed="rId11"/>
+                    <a:stretch>
+                      <a:fillRect/>
+                    </a:stretch>
+                  </pic:blipFill>
+                  <pic:spPr>
+                    <a:xfrm>
+                      <a:off x="0" y="0"/>
+                      <a:ext cx="5943600" cy="3714750"/>
+                    </a:xfrm>
+                    <a:prstGeom prst="rect"/>
+                  </pic:spPr>
+                </pic:pic>
+              </a:graphicData>
+            </a:graphic>
+          </wp:inline>
+        </w:drawing>
+      </w:r>
+    </w:p>
+    <w:p>
+      <w:pPr>
+        <w:spacing w:line="480" w:lineRule="auto" w:before="0" w:after="0"/>
+        <w:ind w:left="0" w:firstLine="0"/>
+        <w:jc w:val="left"/>
+      </w:pPr>
+      <w:r>
+        <w:rPr>
+          <w:rFonts w:ascii="Times New Roman" w:hAnsi="Times New Roman" w:cs="Times New Roman" w:eastAsia="Times New Roman"/>
+          <w:b w:val="0"/>
+          <w:i/>
+          <w:color w:val="000000"/>
+          <w:sz w:val="24"/>
+        </w:rPr>
+        <w:t xml:space="preserve">Note. </w:t>
+      </w:r>
+      <w:r>
+        <w:rPr>
+          <w:rFonts w:ascii="Times New Roman" w:hAnsi="Times New Roman" w:cs="Times New Roman" w:eastAsia="Times New Roman"/>
+          <w:b w:val="0"/>
+          <w:i w:val="0"/>
+          <w:color w:val="000000"/>
+          <w:sz w:val="24"/>
+        </w:rPr>
+        <w:t>The system clock reads 3:37 a.m. on October 18, 2026. The browser is at localhost port 5173 and shows demo mode because no Gemini API key is set.</w:t>
       </w:r>
       <w:r>
         <w:rPr>

</xml_diff>